<commit_message>
Actualización de Documentación de evidencias y documentos
</commit_message>
<xml_diff>
--- a/Fase 2/Evidencias Proyecto/Evidencias de documentación.docx
+++ b/Fase 2/Evidencias Proyecto/Evidencias de documentación.docx
@@ -2,6 +2,439 @@
 <file path=word/document.xml><?xml version="1.0" encoding="utf-8"?>
 <w:document xmlns:wpc="http://schemas.microsoft.com/office/word/2010/wordprocessingCanvas" xmlns:cx="http://schemas.microsoft.com/office/drawing/2014/chartex" xmlns:cx1="http://schemas.microsoft.com/office/drawing/2015/9/8/chartex" xmlns:cx2="http://schemas.microsoft.com/office/drawing/2015/10/21/chartex" xmlns:cx3="http://schemas.microsoft.com/office/drawing/2016/5/9/chartex" xmlns:cx4="http://schemas.microsoft.com/office/drawing/2016/5/10/chartex" xmlns:cx5="http://schemas.microsoft.com/office/drawing/2016/5/11/chartex" xmlns:cx6="http://schemas.microsoft.com/office/drawing/2016/5/12/chartex" xmlns:cx7="http://schemas.microsoft.com/office/drawing/2016/5/13/chartex" xmlns:cx8="http://schemas.microsoft.com/office/drawing/2016/5/14/chartex" xmlns:mc="http://schemas.openxmlformats.org/markup-compatibility/2006" xmlns:aink="http://schemas.microsoft.com/office/drawing/2016/ink" xmlns:am3d="http://schemas.microsoft.com/office/drawing/2017/model3d" xmlns:o="urn:schemas-microsoft-com:office:office" xmlns:oel="http://schemas.microsoft.com/office/2019/extlst" xmlns:r="http://schemas.openxmlformats.org/officeDocument/2006/relationships" xmlns:m="http://schemas.openxmlformats.org/officeDocument/2006/math" xmlns:v="urn:schemas-microsoft-com:vml" xmlns:wp14="http://schemas.microsoft.com/office/word/2010/wordprocessingDrawing" xmlns:wp="http://schemas.openxmlformats.org/drawingml/2006/wordprocessingDrawing" xmlns:w10="urn:schemas-microsoft-com:office:word" xmlns:w="http://schemas.openxmlformats.org/wordprocessingml/2006/main" xmlns:w14="http://schemas.microsoft.com/office/word/2010/wordml" xmlns:w15="http://schemas.microsoft.com/office/word/2012/wordml" xmlns:w16cex="http://schemas.microsoft.com/office/word/2018/wordml/cex" xmlns:w16cid="http://schemas.microsoft.com/office/word/2016/wordml/cid" xmlns:w16="http://schemas.microsoft.com/office/word/2018/wordml" xmlns:w16du="http://schemas.microsoft.com/office/word/2023/wordml/word16du" xmlns:w16sdtdh="http://schemas.microsoft.com/office/word/2020/wordml/sdtdatahash" xmlns:w16sdtfl="http://schemas.microsoft.com/office/word/2024/wordml/sdtformatlock" xmlns:w16se="http://schemas.microsoft.com/office/word/2015/wordml/symex" xmlns:wpg="http://schemas.microsoft.com/office/word/2010/wordprocessingGroup" xmlns:wpi="http://schemas.microsoft.com/office/word/2010/wordprocessingInk" xmlns:wne="http://schemas.microsoft.com/office/word/2006/wordml" xmlns:wps="http://schemas.microsoft.com/office/word/2010/wordprocessingShape" mc:Ignorable="w14 w15 w16se w16cid w16 w16cex w16sdtdh w16sdtfl w16du wp14">
   <w:body>
+    <w:p>
+      <w:pPr>
+        <w:pStyle w:val="Ttulo"/>
+        <w:jc w:val="center"/>
+      </w:pPr>
+      <w:r>
+        <w:t xml:space="preserve">Documento de Evidencias </w:t>
+      </w:r>
+      <w:r>
+        <w:t xml:space="preserve">de la Documentación </w:t>
+      </w:r>
+      <w:proofErr w:type="spellStart"/>
+      <w:r>
+        <w:t>MediTriage</w:t>
+      </w:r>
+      <w:proofErr w:type="spellEnd"/>
+    </w:p>
+    <w:p>
+      <w:pPr>
+        <w:pStyle w:val="Subttulo"/>
+        <w:jc w:val="center"/>
+      </w:pPr>
+      <w:r>
+        <w:t>Capstone</w:t>
+      </w:r>
+    </w:p>
+    <w:p>
+      <w:pPr>
+        <w:pStyle w:val="Subttulo"/>
+      </w:pPr>
+    </w:p>
+    <w:p>
+      <w:pPr>
+        <w:pStyle w:val="Subttulo"/>
+      </w:pPr>
+    </w:p>
+    <w:p>
+      <w:pPr>
+        <w:pStyle w:val="Subttulo"/>
+      </w:pPr>
+    </w:p>
+    <w:p>
+      <w:pPr>
+        <w:pStyle w:val="Subttulo"/>
+      </w:pPr>
+    </w:p>
+    <w:p>
+      <w:pPr>
+        <w:pStyle w:val="Subttulo"/>
+      </w:pPr>
+    </w:p>
+    <w:p>
+      <w:pPr>
+        <w:pStyle w:val="Subttulo"/>
+      </w:pPr>
+    </w:p>
+    <w:p>
+      <w:pPr>
+        <w:pStyle w:val="Subttulo"/>
+      </w:pPr>
+    </w:p>
+    <w:p>
+      <w:pPr>
+        <w:pStyle w:val="Subttulo"/>
+      </w:pPr>
+    </w:p>
+    <w:p>
+      <w:pPr>
+        <w:pStyle w:val="Subttulo"/>
+      </w:pPr>
+    </w:p>
+    <w:p>
+      <w:pPr>
+        <w:pStyle w:val="Subttulo"/>
+      </w:pPr>
+    </w:p>
+    <w:p>
+      <w:pPr>
+        <w:pStyle w:val="Subttulo"/>
+      </w:pPr>
+    </w:p>
+    <w:p>
+      <w:pPr>
+        <w:pStyle w:val="Subttulo"/>
+      </w:pPr>
+    </w:p>
+    <w:p>
+      <w:pPr>
+        <w:pStyle w:val="Subttulo"/>
+      </w:pPr>
+    </w:p>
+    <w:p>
+      <w:pPr>
+        <w:pStyle w:val="Subttulo"/>
+      </w:pPr>
+    </w:p>
+    <w:p>
+      <w:pPr>
+        <w:pStyle w:val="Subttulo"/>
+      </w:pPr>
+    </w:p>
+    <w:p>
+      <w:pPr>
+        <w:pStyle w:val="Subttulo"/>
+      </w:pPr>
+    </w:p>
+    <w:p>
+      <w:pPr>
+        <w:pStyle w:val="Subttulo"/>
+      </w:pPr>
+    </w:p>
+    <w:p>
+      <w:pPr>
+        <w:pStyle w:val="Subttulo"/>
+      </w:pPr>
+      <w:r>
+        <w:t>Raul Benavides</w:t>
+      </w:r>
+    </w:p>
+    <w:p>
+      <w:pPr>
+        <w:pStyle w:val="Subttulo"/>
+      </w:pPr>
+      <w:r>
+        <w:t>Matias Cuevas</w:t>
+      </w:r>
+    </w:p>
+    <w:p>
+      <w:pPr>
+        <w:jc w:val="right"/>
+      </w:pPr>
+      <w:r>
+        <w:t>23-09-2025</w:t>
+      </w:r>
+    </w:p>
+    <w:p>
+      <w:pPr>
+        <w:pStyle w:val="Ttulo1"/>
+      </w:pPr>
+      <w:bookmarkStart w:id="0" w:name="_Toc210125745"/>
+      <w:proofErr w:type="spellStart"/>
+      <w:r>
+        <w:lastRenderedPageBreak/>
+        <w:t>Indice</w:t>
+      </w:r>
+      <w:bookmarkEnd w:id="0"/>
+      <w:proofErr w:type="spellEnd"/>
+    </w:p>
+    <w:sdt>
+      <w:sdtPr>
+        <w:rPr>
+          <w:rFonts w:asciiTheme="minorHAnsi" w:eastAsiaTheme="minorHAnsi" w:hAnsiTheme="minorHAnsi" w:cstheme="minorBidi"/>
+          <w:color w:val="auto"/>
+          <w:kern w:val="2"/>
+          <w:sz w:val="24"/>
+          <w:szCs w:val="24"/>
+          <w:lang w:val="es-ES" w:eastAsia="en-US"/>
+          <w14:ligatures w14:val="standardContextual"/>
+        </w:rPr>
+        <w:id w:val="229742417"/>
+        <w:docPartObj>
+          <w:docPartGallery w:val="Table of Contents"/>
+          <w:docPartUnique/>
+        </w:docPartObj>
+      </w:sdtPr>
+      <w:sdtEndPr>
+        <w:rPr>
+          <w:b/>
+          <w:bCs/>
+          <w:sz w:val="16"/>
+          <w:szCs w:val="16"/>
+        </w:rPr>
+      </w:sdtEndPr>
+      <w:sdtContent>
+        <w:p>
+          <w:pPr>
+            <w:pStyle w:val="TtuloTDC"/>
+          </w:pPr>
+          <w:r>
+            <w:rPr>
+              <w:lang w:val="es-ES"/>
+            </w:rPr>
+            <w:t>Contenido</w:t>
+          </w:r>
+        </w:p>
+        <w:p>
+          <w:pPr>
+            <w:pStyle w:val="TDC1"/>
+            <w:tabs>
+              <w:tab w:val="right" w:leader="dot" w:pos="8828"/>
+            </w:tabs>
+            <w:rPr>
+              <w:rFonts w:eastAsiaTheme="minorEastAsia"/>
+              <w:noProof/>
+              <w:lang w:eastAsia="es-CL"/>
+            </w:rPr>
+          </w:pPr>
+          <w:r>
+            <w:rPr>
+              <w:sz w:val="16"/>
+              <w:szCs w:val="16"/>
+            </w:rPr>
+            <w:fldChar w:fldCharType="begin"/>
+          </w:r>
+          <w:r>
+            <w:rPr>
+              <w:sz w:val="16"/>
+              <w:szCs w:val="16"/>
+            </w:rPr>
+            <w:instrText xml:space="preserve"> TOC \o "1-3" \h \z \u </w:instrText>
+          </w:r>
+          <w:r>
+            <w:rPr>
+              <w:sz w:val="16"/>
+              <w:szCs w:val="16"/>
+            </w:rPr>
+            <w:fldChar w:fldCharType="separate"/>
+          </w:r>
+          <w:hyperlink w:anchor="_Toc210125745" w:history="1">
+            <w:r>
+              <w:rPr>
+                <w:rStyle w:val="Hipervnculo"/>
+                <w:noProof/>
+              </w:rPr>
+              <w:t>Indice</w:t>
+            </w:r>
+            <w:r>
+              <w:rPr>
+                <w:noProof/>
+                <w:webHidden/>
+              </w:rPr>
+              <w:tab/>
+            </w:r>
+            <w:r>
+              <w:rPr>
+                <w:noProof/>
+                <w:webHidden/>
+              </w:rPr>
+              <w:fldChar w:fldCharType="begin"/>
+            </w:r>
+            <w:r>
+              <w:rPr>
+                <w:noProof/>
+                <w:webHidden/>
+              </w:rPr>
+              <w:instrText xml:space="preserve"> PAGEREF _Toc210125745 \h </w:instrText>
+            </w:r>
+            <w:r>
+              <w:rPr>
+                <w:noProof/>
+                <w:webHidden/>
+              </w:rPr>
+            </w:r>
+            <w:r>
+              <w:rPr>
+                <w:noProof/>
+                <w:webHidden/>
+              </w:rPr>
+              <w:fldChar w:fldCharType="separate"/>
+            </w:r>
+            <w:r>
+              <w:rPr>
+                <w:noProof/>
+                <w:webHidden/>
+              </w:rPr>
+              <w:t>2</w:t>
+            </w:r>
+            <w:r>
+              <w:rPr>
+                <w:noProof/>
+                <w:webHidden/>
+              </w:rPr>
+              <w:fldChar w:fldCharType="end"/>
+            </w:r>
+          </w:hyperlink>
+        </w:p>
+        <w:p>
+          <w:pPr>
+            <w:rPr>
+              <w:b/>
+              <w:bCs/>
+              <w:sz w:val="16"/>
+              <w:szCs w:val="16"/>
+              <w:lang w:val="es-ES"/>
+            </w:rPr>
+          </w:pPr>
+          <w:r>
+            <w:rPr>
+              <w:b/>
+              <w:bCs/>
+              <w:sz w:val="16"/>
+              <w:szCs w:val="16"/>
+              <w:lang w:val="es-ES"/>
+            </w:rPr>
+            <w:fldChar w:fldCharType="end"/>
+          </w:r>
+        </w:p>
+      </w:sdtContent>
+    </w:sdt>
+    <w:p>
+      <w:pPr>
+        <w:rPr>
+          <w:b/>
+          <w:bCs/>
+          <w:sz w:val="16"/>
+          <w:szCs w:val="16"/>
+          <w:lang w:val="es-ES"/>
+        </w:rPr>
+      </w:pPr>
+      <w:r>
+        <w:rPr>
+          <w:b/>
+          <w:bCs/>
+          <w:sz w:val="16"/>
+          <w:szCs w:val="16"/>
+          <w:lang w:val="es-ES"/>
+        </w:rPr>
+        <w:br w:type="page"/>
+      </w:r>
+    </w:p>
+    <w:p>
+      <w:pPr>
+        <w:pStyle w:val="Ttulo1"/>
+      </w:pPr>
+      <w:bookmarkStart w:id="1" w:name="_Toc210120531"/>
+      <w:r>
+        <w:lastRenderedPageBreak/>
+        <w:t>Introducción</w:t>
+      </w:r>
+      <w:bookmarkEnd w:id="1"/>
+    </w:p>
+    <w:p>
+      <w:r>
+        <w:t xml:space="preserve">El siguiente documento tiene por finalidad recopilar las evidencias de documentación del proyecto </w:t>
+      </w:r>
+      <w:proofErr w:type="spellStart"/>
+      <w:r>
+        <w:t>MediTriage</w:t>
+      </w:r>
+      <w:proofErr w:type="spellEnd"/>
+      <w:r>
+        <w:t xml:space="preserve"> </w:t>
+      </w:r>
+      <w:r>
+        <w:t xml:space="preserve">una plataforma web orientada a la gestión de citas médicas en línea con integración de servicios inteligentes. El objetivo de este documento es demostrar, mediante capturas, </w:t>
+      </w:r>
+      <w:r>
+        <w:t>flujos</w:t>
+      </w:r>
+      <w:r>
+        <w:t xml:space="preserve"> y </w:t>
+      </w:r>
+      <w:r>
+        <w:t>documentos</w:t>
+      </w:r>
+      <w:r>
+        <w:t>, el cumplimiento de los requerimientos establecidos y la correcta implementación de cada uno de los componentes del sistema.</w:t>
+      </w:r>
+    </w:p>
+    <w:p>
+      <w:r>
+        <w:br w:type="page"/>
+      </w:r>
+    </w:p>
+    <w:p>
+      <w:pPr>
+        <w:pStyle w:val="Ttulo1"/>
+      </w:pPr>
+      <w:r>
+        <w:lastRenderedPageBreak/>
+        <w:t>Diagrama de Flujos</w:t>
+      </w:r>
+    </w:p>
+    <w:p>
+      <w:pPr>
+        <w:pStyle w:val="Ttulo2"/>
+      </w:pPr>
+      <w:r>
+        <w:t>Agendar (Con Cuenta)</w:t>
+      </w:r>
+    </w:p>
+    <w:p>
+      <w:r>
+        <w:drawing>
+          <wp:inline distT="0" distB="0" distL="0" distR="0" wp14:anchorId="111E2974" wp14:editId="2C43455B">
+            <wp:extent cx="5612130" cy="6555105"/>
+            <wp:effectExtent l="0" t="0" r="7620" b="0"/>
+            <wp:docPr id="1976189991" name="Imagen 2"/>
+            <wp:cNvGraphicFramePr>
+              <a:graphicFrameLocks xmlns:a="http://schemas.openxmlformats.org/drawingml/2006/main" noChangeAspect="1"/>
+            </wp:cNvGraphicFramePr>
+            <a:graphic xmlns:a="http://schemas.openxmlformats.org/drawingml/2006/main">
+              <a:graphicData uri="http://schemas.openxmlformats.org/drawingml/2006/picture">
+                <pic:pic xmlns:pic="http://schemas.openxmlformats.org/drawingml/2006/picture">
+                  <pic:nvPicPr>
+                    <pic:cNvPr id="0" name="Picture 6"/>
+                    <pic:cNvPicPr>
+                      <a:picLocks noChangeAspect="1" noChangeArrowheads="1"/>
+                    </pic:cNvPicPr>
+                  </pic:nvPicPr>
+                  <pic:blipFill>
+                    <a:blip r:embed="rId4">
+                      <a:extLst>
+                        <a:ext uri="{28A0092B-C50C-407E-A947-70E740481C1C}">
+                          <a14:useLocalDpi xmlns:a14="http://schemas.microsoft.com/office/drawing/2010/main" val="0"/>
+                        </a:ext>
+                      </a:extLst>
+                    </a:blip>
+                    <a:srcRect/>
+                    <a:stretch>
+                      <a:fillRect/>
+                    </a:stretch>
+                  </pic:blipFill>
+                  <pic:spPr bwMode="auto">
+                    <a:xfrm>
+                      <a:off x="0" y="0"/>
+                      <a:ext cx="5612130" cy="6555105"/>
+                    </a:xfrm>
+                    <a:prstGeom prst="rect">
+                      <a:avLst/>
+                    </a:prstGeom>
+                    <a:noFill/>
+                    <a:ln>
+                      <a:noFill/>
+                    </a:ln>
+                  </pic:spPr>
+                </pic:pic>
+              </a:graphicData>
+            </a:graphic>
+          </wp:inline>
+        </w:drawing>
+      </w:r>
+    </w:p>
     <w:p/>
     <w:sectPr>
       <w:pgSz w:w="12240" w:h="15840"/>
@@ -413,6 +846,7 @@
   <w:style w:type="paragraph" w:default="1" w:styleId="Normal">
     <w:name w:val="Normal"/>
     <w:qFormat/>
+    <w:rsid w:val="00E956CF"/>
   </w:style>
   <w:style w:type="paragraph" w:styleId="Ttulo1">
     <w:name w:val="heading 1"/>
@@ -441,7 +875,6 @@
     <w:next w:val="Normal"/>
     <w:link w:val="Ttulo2Car"/>
     <w:uiPriority w:val="9"/>
-    <w:semiHidden/>
     <w:unhideWhenUsed/>
     <w:qFormat/>
     <w:rsid w:val="008A5F70"/>
@@ -616,7 +1049,6 @@
   <w:style w:type="character" w:default="1" w:styleId="Fuentedeprrafopredeter">
     <w:name w:val="Default Paragraph Font"/>
     <w:uiPriority w:val="1"/>
-    <w:semiHidden/>
     <w:unhideWhenUsed/>
   </w:style>
   <w:style w:type="table" w:default="1" w:styleId="Tablanormal">
@@ -658,7 +1090,6 @@
     <w:basedOn w:val="Fuentedeprrafopredeter"/>
     <w:link w:val="Ttulo2"/>
     <w:uiPriority w:val="9"/>
-    <w:semiHidden/>
     <w:rsid w:val="008A5F70"/>
     <w:rPr>
       <w:rFonts w:asciiTheme="majorHAnsi" w:eastAsiaTheme="majorEastAsia" w:hAnsiTheme="majorHAnsi" w:cstheme="majorBidi"/>
@@ -929,6 +1360,75 @@
       <w:color w:val="0F4761" w:themeColor="accent1" w:themeShade="BF"/>
       <w:spacing w:val="5"/>
     </w:rPr>
+  </w:style>
+  <w:style w:type="paragraph" w:styleId="TtuloTDC">
+    <w:name w:val="TOC Heading"/>
+    <w:basedOn w:val="Ttulo1"/>
+    <w:next w:val="Normal"/>
+    <w:uiPriority w:val="39"/>
+    <w:unhideWhenUsed/>
+    <w:qFormat/>
+    <w:rsid w:val="00E956CF"/>
+    <w:pPr>
+      <w:spacing w:before="240" w:after="0" w:line="259" w:lineRule="auto"/>
+      <w:outlineLvl w:val="9"/>
+    </w:pPr>
+    <w:rPr>
+      <w:kern w:val="0"/>
+      <w:sz w:val="32"/>
+      <w:szCs w:val="32"/>
+      <w:lang w:eastAsia="es-CL"/>
+      <w14:ligatures w14:val="none"/>
+    </w:rPr>
+  </w:style>
+  <w:style w:type="paragraph" w:styleId="TDC1">
+    <w:name w:val="toc 1"/>
+    <w:basedOn w:val="Normal"/>
+    <w:next w:val="Normal"/>
+    <w:autoRedefine/>
+    <w:uiPriority w:val="39"/>
+    <w:unhideWhenUsed/>
+    <w:rsid w:val="00E956CF"/>
+    <w:pPr>
+      <w:spacing w:after="100"/>
+    </w:pPr>
+  </w:style>
+  <w:style w:type="character" w:styleId="Hipervnculo">
+    <w:name w:val="Hyperlink"/>
+    <w:basedOn w:val="Fuentedeprrafopredeter"/>
+    <w:uiPriority w:val="99"/>
+    <w:unhideWhenUsed/>
+    <w:rsid w:val="00E956CF"/>
+    <w:rPr>
+      <w:color w:val="467886" w:themeColor="hyperlink"/>
+      <w:u w:val="single"/>
+    </w:rPr>
+  </w:style>
+  <w:style w:type="paragraph" w:styleId="TDC2">
+    <w:name w:val="toc 2"/>
+    <w:basedOn w:val="Normal"/>
+    <w:next w:val="Normal"/>
+    <w:autoRedefine/>
+    <w:uiPriority w:val="39"/>
+    <w:unhideWhenUsed/>
+    <w:rsid w:val="00E956CF"/>
+    <w:pPr>
+      <w:spacing w:after="100"/>
+      <w:ind w:left="240"/>
+    </w:pPr>
+  </w:style>
+  <w:style w:type="paragraph" w:styleId="TDC3">
+    <w:name w:val="toc 3"/>
+    <w:basedOn w:val="Normal"/>
+    <w:next w:val="Normal"/>
+    <w:autoRedefine/>
+    <w:uiPriority w:val="39"/>
+    <w:unhideWhenUsed/>
+    <w:rsid w:val="00E956CF"/>
+    <w:pPr>
+      <w:spacing w:after="100"/>
+      <w:ind w:left="480"/>
+    </w:pPr>
   </w:style>
 </w:styles>
 </file>

</xml_diff>

<commit_message>
Actualización diagrama de flujos
</commit_message>
<xml_diff>
--- a/Fase 2/Evidencias Proyecto/Evidencias de documentación.docx
+++ b/Fase 2/Evidencias Proyecto/Evidencias de documentación.docx
@@ -13,11 +13,9 @@
       <w:r>
         <w:t xml:space="preserve">de la Documentación </w:t>
       </w:r>
-      <w:proofErr w:type="spellStart"/>
       <w:r>
         <w:t>MediTriage</w:t>
       </w:r>
-      <w:proofErr w:type="spellEnd"/>
     </w:p>
     <w:p>
       <w:pPr>
@@ -142,13 +140,11 @@
         <w:pStyle w:val="Ttulo1"/>
       </w:pPr>
       <w:bookmarkStart w:id="0" w:name="_Toc210125745"/>
-      <w:proofErr w:type="spellStart"/>
       <w:r>
         <w:lastRenderedPageBreak/>
         <w:t>Indice</w:t>
       </w:r>
       <w:bookmarkEnd w:id="0"/>
-      <w:proofErr w:type="spellEnd"/>
     </w:p>
     <w:sdt>
       <w:sdtPr>
@@ -335,15 +331,7 @@
     </w:p>
     <w:p>
       <w:r>
-        <w:t xml:space="preserve">El siguiente documento tiene por finalidad recopilar las evidencias de documentación del proyecto </w:t>
-      </w:r>
-      <w:proofErr w:type="spellStart"/>
-      <w:r>
-        <w:t>MediTriage</w:t>
-      </w:r>
-      <w:proofErr w:type="spellEnd"/>
-      <w:r>
-        <w:t xml:space="preserve"> </w:t>
+        <w:t xml:space="preserve">El siguiente documento tiene por finalidad recopilar las evidencias de documentación del proyecto MediTriage </w:t>
       </w:r>
       <w:r>
         <w:t xml:space="preserve">una plataforma web orientada a la gestión de citas médicas en línea con integración de servicios inteligentes. El objetivo de este documento es demostrar, mediante capturas, </w:t>
@@ -385,11 +373,14 @@
     </w:p>
     <w:p>
       <w:r>
+        <w:rPr>
+          <w:noProof/>
+        </w:rPr>
         <w:drawing>
-          <wp:inline distT="0" distB="0" distL="0" distR="0" wp14:anchorId="111E2974" wp14:editId="2C43455B">
-            <wp:extent cx="5612130" cy="6555105"/>
+          <wp:inline distT="0" distB="0" distL="0" distR="0" wp14:anchorId="5201F61E" wp14:editId="7F9597BD">
+            <wp:extent cx="5612130" cy="6559550"/>
             <wp:effectExtent l="0" t="0" r="7620" b="0"/>
-            <wp:docPr id="1976189991" name="Imagen 2"/>
+            <wp:docPr id="1348572099" name="Imagen 3" descr="Diagrama&#10;&#10;El contenido generado por IA puede ser incorrecto."/>
             <wp:cNvGraphicFramePr>
               <a:graphicFrameLocks xmlns:a="http://schemas.openxmlformats.org/drawingml/2006/main" noChangeAspect="1"/>
             </wp:cNvGraphicFramePr>
@@ -397,7 +388,7 @@
               <a:graphicData uri="http://schemas.openxmlformats.org/drawingml/2006/picture">
                 <pic:pic xmlns:pic="http://schemas.openxmlformats.org/drawingml/2006/picture">
                   <pic:nvPicPr>
-                    <pic:cNvPr id="0" name="Picture 6"/>
+                    <pic:cNvPr id="1348572099" name="Imagen 3" descr="Diagrama&#10;&#10;El contenido generado por IA puede ser incorrecto."/>
                     <pic:cNvPicPr>
                       <a:picLocks noChangeAspect="1" noChangeArrowheads="1"/>
                     </pic:cNvPicPr>
@@ -418,7 +409,68 @@
                   <pic:spPr bwMode="auto">
                     <a:xfrm>
                       <a:off x="0" y="0"/>
-                      <a:ext cx="5612130" cy="6555105"/>
+                      <a:ext cx="5612130" cy="6559550"/>
+                    </a:xfrm>
+                    <a:prstGeom prst="rect">
+                      <a:avLst/>
+                    </a:prstGeom>
+                    <a:noFill/>
+                    <a:ln>
+                      <a:noFill/>
+                    </a:ln>
+                  </pic:spPr>
+                </pic:pic>
+              </a:graphicData>
+            </a:graphic>
+          </wp:inline>
+        </w:drawing>
+      </w:r>
+    </w:p>
+    <w:p>
+      <w:pPr>
+        <w:pStyle w:val="Ttulo2"/>
+      </w:pPr>
+      <w:r>
+        <w:lastRenderedPageBreak/>
+        <w:t>Agendar (Invitado)</w:t>
+      </w:r>
+    </w:p>
+    <w:p>
+      <w:r>
+        <w:drawing>
+          <wp:inline distT="0" distB="0" distL="0" distR="0" wp14:anchorId="17773BB2" wp14:editId="522BEC59">
+            <wp:extent cx="5612130" cy="4605655"/>
+            <wp:effectExtent l="0" t="0" r="7620" b="4445"/>
+            <wp:docPr id="660527409" name="Imagen 5"/>
+            <wp:cNvGraphicFramePr>
+              <a:graphicFrameLocks xmlns:a="http://schemas.openxmlformats.org/drawingml/2006/main" noChangeAspect="1"/>
+            </wp:cNvGraphicFramePr>
+            <a:graphic xmlns:a="http://schemas.openxmlformats.org/drawingml/2006/main">
+              <a:graphicData uri="http://schemas.openxmlformats.org/drawingml/2006/picture">
+                <pic:pic xmlns:pic="http://schemas.openxmlformats.org/drawingml/2006/picture">
+                  <pic:nvPicPr>
+                    <pic:cNvPr id="0" name="Picture 15"/>
+                    <pic:cNvPicPr>
+                      <a:picLocks noChangeAspect="1" noChangeArrowheads="1"/>
+                    </pic:cNvPicPr>
+                  </pic:nvPicPr>
+                  <pic:blipFill>
+                    <a:blip r:embed="rId5">
+                      <a:extLst>
+                        <a:ext uri="{28A0092B-C50C-407E-A947-70E740481C1C}">
+                          <a14:useLocalDpi xmlns:a14="http://schemas.microsoft.com/office/drawing/2010/main" val="0"/>
+                        </a:ext>
+                      </a:extLst>
+                    </a:blip>
+                    <a:srcRect/>
+                    <a:stretch>
+                      <a:fillRect/>
+                    </a:stretch>
+                  </pic:blipFill>
+                  <pic:spPr bwMode="auto">
+                    <a:xfrm>
+                      <a:off x="0" y="0"/>
+                      <a:ext cx="5612130" cy="4605655"/>
                     </a:xfrm>
                     <a:prstGeom prst="rect">
                       <a:avLst/>

</xml_diff>